<commit_message>
fix(sales): letterhead move to TOP + all bold + correct order match khách mẫu
Theo phản hồi khách "chưa giống mẫu":
- Letterhead phải ở ĐỈNH trang (trước title "SALES CONTRACT" / "PROFORMA INVOICE"),
  không phải sau title như trước
- TẤT CẢ 6 dòng đều BOLD
- Line 1 (HUY ANH RUBBER ...) lớn hơn (sz=40 ~20pt) so với các dòng dưới
- Xóa block "THE SELLER: ..." cũ vì đã có trong letterhead

Format mới (centered, all bold):
  HUY ANH RUBBER COMPANY LIMITED              sz=40 (20pt)
  KHE MA, PHONG DIEN WARD, HUE CITY, VIET NAM  sz=26 (13pt)
  TEL: 054.3774994       FAX: 054.3774995      sz=26 (13pt)
  Mobi/Whatsapp: +84971619955 | +84 974398488  sz=24 (12pt)
  Email: Sales@huyanhrubber.com | Huylv@huyanhrubber.com  sz=24
  Website: Huyanhrubber.com.vn                 sz=24

Cả 4 template (SC_CIF, PI_CIF, SC_FOB, PI_FOB) đều có letterhead identical
ở đỉnh trang. THE SELLER block cũ đã xóa.

Co-Authored-By: Claude Opus 4.7 (1M context) <noreply@anthropic.com>
</commit_message>
<xml_diff>
--- a/docs/contract-templates/template_PI_CIF.docx
+++ b/docs/contract-templates/template_PI_CIF.docx
@@ -177,6 +177,150 @@
           <w:szCs w:val="16"/>
         </w:rPr>
       </w:pPr>
+      <w:r>
+        <w:rPr>
+          <w:sz w:val="40"/>
+          <w:szCs w:val="40"/>
+          <w:b/>
+        </w:rPr>
+        <w:t>HUY ANH RUBBER COMPANY LIMITED</w:t>
+      </w:r>
+    </w:p>
+    <w:p>
+      <w:pPr>
+        <w:autoSpaceDE w:val="0"/>
+        <w:autoSpaceDN w:val="0"/>
+        <w:adjustRightInd w:val="0"/>
+        <w:jc w:val="center"/>
+        <w:rPr>
+          <w:rFonts w:asciiTheme="majorHAnsi" w:hAnsiTheme="majorHAnsi"/>
+          <w:b/>
+          <w:bCs/>
+          <w:color w:val="000000"/>
+          <w:sz w:val="16"/>
+          <w:szCs w:val="16"/>
+        </w:rPr>
+      </w:pPr>
+      <w:r>
+        <w:rPr>
+          <w:sz w:val="26"/>
+          <w:szCs w:val="26"/>
+          <w:b/>
+        </w:rPr>
+        <w:t>KHE MA, PHONG DIEN WARD, HUE CITY, VIET NAM</w:t>
+      </w:r>
+    </w:p>
+    <w:p>
+      <w:pPr>
+        <w:autoSpaceDE w:val="0"/>
+        <w:autoSpaceDN w:val="0"/>
+        <w:adjustRightInd w:val="0"/>
+        <w:jc w:val="center"/>
+        <w:rPr>
+          <w:rFonts w:asciiTheme="majorHAnsi" w:hAnsiTheme="majorHAnsi"/>
+          <w:b/>
+          <w:bCs/>
+          <w:color w:val="000000"/>
+          <w:sz w:val="16"/>
+          <w:szCs w:val="16"/>
+        </w:rPr>
+      </w:pPr>
+      <w:r>
+        <w:rPr>
+          <w:sz w:val="26"/>
+          <w:szCs w:val="26"/>
+          <w:b/>
+        </w:rPr>
+        <w:t>TEL: 054.3774994       FAX: 054.3774995</w:t>
+      </w:r>
+    </w:p>
+    <w:p>
+      <w:pPr>
+        <w:autoSpaceDE w:val="0"/>
+        <w:autoSpaceDN w:val="0"/>
+        <w:adjustRightInd w:val="0"/>
+        <w:jc w:val="center"/>
+        <w:rPr>
+          <w:rFonts w:asciiTheme="majorHAnsi" w:hAnsiTheme="majorHAnsi"/>
+          <w:b/>
+          <w:bCs/>
+          <w:color w:val="000000"/>
+          <w:sz w:val="16"/>
+          <w:szCs w:val="16"/>
+        </w:rPr>
+      </w:pPr>
+      <w:r>
+        <w:rPr>
+          <w:sz w:val="24"/>
+          <w:szCs w:val="24"/>
+          <w:b/>
+        </w:rPr>
+        <w:t>Mobi/Whatsapp: +84971619955 | +84 974398488</w:t>
+      </w:r>
+    </w:p>
+    <w:p>
+      <w:pPr>
+        <w:autoSpaceDE w:val="0"/>
+        <w:autoSpaceDN w:val="0"/>
+        <w:adjustRightInd w:val="0"/>
+        <w:jc w:val="center"/>
+        <w:rPr>
+          <w:rFonts w:asciiTheme="majorHAnsi" w:hAnsiTheme="majorHAnsi"/>
+          <w:b/>
+          <w:bCs/>
+          <w:color w:val="000000"/>
+          <w:sz w:val="16"/>
+          <w:szCs w:val="16"/>
+        </w:rPr>
+      </w:pPr>
+      <w:r>
+        <w:rPr>
+          <w:sz w:val="24"/>
+          <w:szCs w:val="24"/>
+          <w:b/>
+        </w:rPr>
+        <w:t>Email: Sales@huyanhrubber.com | Huylv@huyanhrubber.com</w:t>
+      </w:r>
+    </w:p>
+    <w:p>
+      <w:pPr>
+        <w:autoSpaceDE w:val="0"/>
+        <w:autoSpaceDN w:val="0"/>
+        <w:adjustRightInd w:val="0"/>
+        <w:jc w:val="center"/>
+        <w:rPr>
+          <w:rFonts w:asciiTheme="majorHAnsi" w:hAnsiTheme="majorHAnsi"/>
+          <w:b/>
+          <w:bCs/>
+          <w:color w:val="000000"/>
+          <w:sz w:val="16"/>
+          <w:szCs w:val="16"/>
+        </w:rPr>
+      </w:pPr>
+      <w:r>
+        <w:rPr>
+          <w:sz w:val="24"/>
+          <w:szCs w:val="24"/>
+          <w:b/>
+        </w:rPr>
+        <w:t>Website: Huyanhrubber.com.vn</w:t>
+      </w:r>
+    </w:p>
+    <w:p>
+      <w:pPr>
+        <w:autoSpaceDE w:val="0"/>
+        <w:autoSpaceDN w:val="0"/>
+        <w:adjustRightInd w:val="0"/>
+        <w:jc w:val="center"/>
+        <w:rPr>
+          <w:rFonts w:asciiTheme="majorHAnsi" w:hAnsiTheme="majorHAnsi"/>
+          <w:b/>
+          <w:bCs/>
+          <w:color w:val="000000"/>
+          <w:sz w:val="16"/>
+          <w:szCs w:val="16"/>
+        </w:rPr>
+      </w:pPr>
     </w:p>
     <w:p>
       <w:pPr>
@@ -271,128 +415,6 @@
         </w:rPr>
         <w:t>Date: {contract_date}</w:t>
       </w:r>
-    </w:p>
-    <w:p>
-      <w:pPr>
-        <w:spacing w:line="276" w:lineRule="auto"/>
-        <w:jc w:val="center"/>
-        <w:rPr>
-          <w:rFonts w:asciiTheme="majorHAnsi" w:eastAsia="Batang" w:hAnsiTheme="majorHAnsi" w:cs="Arial"/>
-          <w:b/>
-          <w:bCs/>
-          <w:lang w:val="en-US" w:eastAsia="ko-KR"/>
-        </w:rPr>
-      </w:pPr>
-      <w:r>
-        <w:rPr>
-          <w:sz w:val="32"/>
-          <w:szCs w:val="32"/>
-          <w:b/>
-        </w:rPr>
-        <w:t>HUY ANH RUBBER COMPANY LIMITED</w:t>
-      </w:r>
-    </w:p>
-    <w:p>
-      <w:pPr>
-        <w:spacing w:line="276" w:lineRule="auto"/>
-        <w:jc w:val="center"/>
-        <w:rPr>
-          <w:rFonts w:asciiTheme="majorHAnsi" w:eastAsia="Batang" w:hAnsiTheme="majorHAnsi" w:cs="Arial"/>
-          <w:b/>
-          <w:bCs/>
-          <w:lang w:val="en-US" w:eastAsia="ko-KR"/>
-        </w:rPr>
-      </w:pPr>
-      <w:proofErr w:type="gramStart"/>
-      <w:proofErr w:type="gramEnd"/>
-      <w:r>
-        <w:rPr>
-          <w:sz w:val="26"/>
-          <w:szCs w:val="26"/>
-        </w:rPr>
-        <w:t>KHE MA, PHONG DIEN WARD, HUE CITY, VIET NAM</w:t>
-      </w:r>
-    </w:p>
-    <w:p>
-      <w:pPr>
-        <w:spacing w:line="276" w:lineRule="auto"/>
-        <w:jc w:val="center"/>
-        <w:rPr>
-          <w:rFonts w:asciiTheme="majorHAnsi" w:eastAsia="Batang" w:hAnsiTheme="majorHAnsi" w:cs="Arial"/>
-          <w:bCs/>
-          <w:lang w:val="en-US" w:eastAsia="ko-KR"/>
-        </w:rPr>
-      </w:pPr>
-      <w:r>
-        <w:rPr>
-          <w:sz w:val="26"/>
-          <w:szCs w:val="26"/>
-        </w:rPr>
-        <w:t>TEL: 054.3774994       FAX: 054.3774995</w:t>
-      </w:r>
-    </w:p>
-    <w:p>
-      <w:pPr>
-        <w:spacing w:line="276" w:lineRule="auto"/>
-        <w:jc w:val="center"/>
-        <w:rPr>
-          <w:rFonts w:asciiTheme="majorHAnsi" w:eastAsia="Batang" w:hAnsiTheme="majorHAnsi" w:cs="Arial"/>
-          <w:bCs/>
-          <w:lang w:val="en-US" w:eastAsia="ko-KR"/>
-        </w:rPr>
-      </w:pPr>
-      <w:r>
-        <w:rPr>
-          <w:sz w:val="22"/>
-          <w:szCs w:val="22"/>
-        </w:rPr>
-        <w:t>Mobi/Whatsapp: +84971619955 | +84 974398488</w:t>
-      </w:r>
-    </w:p>
-    <w:p>
-      <w:pPr>
-        <w:spacing w:line="276" w:lineRule="auto"/>
-        <w:jc w:val="center"/>
-        <w:rPr>
-          <w:rFonts w:asciiTheme="majorHAnsi" w:eastAsia="Batang" w:hAnsiTheme="majorHAnsi" w:cs="Arial"/>
-          <w:bCs/>
-          <w:lang w:val="en-US" w:eastAsia="ko-KR"/>
-        </w:rPr>
-      </w:pPr>
-      <w:r>
-        <w:rPr>
-          <w:sz w:val="22"/>
-          <w:szCs w:val="22"/>
-        </w:rPr>
-        <w:t>Email: Sales@huyanhrubber.com | Huylv@huyanhrubber.com</w:t>
-      </w:r>
-    </w:p>
-    <w:p>
-      <w:pPr>
-        <w:spacing w:line="276" w:lineRule="auto"/>
-        <w:jc w:val="center"/>
-        <w:rPr>
-          <w:rFonts w:asciiTheme="majorHAnsi" w:eastAsia="Batang" w:hAnsiTheme="majorHAnsi" w:cs="Arial"/>
-          <w:bCs/>
-          <w:lang w:val="en-US" w:eastAsia="ko-KR"/>
-        </w:rPr>
-      </w:pPr>
-      <w:r>
-        <w:rPr>
-          <w:sz w:val="22"/>
-          <w:szCs w:val="22"/>
-        </w:rPr>
-        <w:t>Website: Huyanhrubber.com.vn</w:t>
-      </w:r>
-    </w:p>
-    <w:p>
-      <w:pPr>
-        <w:jc w:val="both"/>
-        <w:rPr>
-          <w:rFonts w:asciiTheme="majorHAnsi" w:eastAsia="Batang" w:hAnsiTheme="majorHAnsi"/>
-          <w:lang w:val="en-US" w:eastAsia="ko-KR"/>
-        </w:rPr>
-      </w:pPr>
     </w:p>
     <w:p>
       <w:pPr>

</xml_diff>

<commit_message>
fix(sales): No/Date — right-aligned italic bold sz=24 (match mẫu PI gốc)
Khách phản hồi 'chưa ổn' khi so sánh với mẫu PI Apollo:
- Mẫu: No/Date right-aligned, italic, BOLD, sz nhỏ hơn (~12pt)
- Em đang để: center sz=28 BOLD (không italic) → trông to và đặt sai vị trí

Sửa _normalize_head_letter():
- _set_align(p, 'right')   (trước: 'center')
- _set_run_sz(r, 24)        (trước: 28)
- _set_italic(r, True)      (mới — thêm helper)
- _set_bold(r, True)        (giữ)
- Trim cả leading + trailing whitespace (PI_FOB có padding manual)

Verified ở cả 4 template:
  SC_CIF:  1: right sz=24 BI 'No.: {contract_no}'
  PI_CIF:  2: right sz=24 BI 'No: {contract_no}/PR.CI'
  SC_FOB:  1: right sz=24 BI 'No.: {contract_no}'
  PI_FOB:  2: right sz=24 BI 'No: {contract_no}/PR.CI'

Co-Authored-By: Claude Opus 4.7 (1M context) <noreply@anthropic.com>
</commit_message>
<xml_diff>
--- a/docs/contract-templates/template_PI_CIF.docx
+++ b/docs/contract-templates/template_PI_CIF.docx
@@ -228,7 +228,7 @@
           <w:szCs w:val="28"/>
           <w:lang w:val="vi-VN"/>
         </w:rPr>
-        <w:jc w:val="center"/>
+        <w:jc w:val="right"/>
       </w:pPr>
       <w:r>
         <w:rPr>
@@ -237,8 +237,8 @@
           <w:i/>
           <w:iCs/>
           <w:color w:val="000000"/>
-          <w:sz w:val="28"/>
-          <w:szCs w:val="28"/>
+          <w:sz w:val="24"/>
+          <w:szCs w:val="24"/>
           <w:b/>
         </w:rPr>
         <w:t>No: {contract_no}/PR.CI</w:t>
@@ -249,7 +249,7 @@
         <w:autoSpaceDE w:val="0"/>
         <w:autoSpaceDN w:val="0"/>
         <w:adjustRightInd w:val="0"/>
-        <w:jc w:val="center"/>
+        <w:jc w:val="right"/>
         <w:rPr>
           <w:rFonts w:asciiTheme="majorHAnsi" w:hAnsiTheme="majorHAnsi"/>
           <w:bCs/>
@@ -265,8 +265,8 @@
           <w:bCs/>
           <w:i/>
           <w:color w:val="000000"/>
-          <w:sz w:val="28"/>
-          <w:szCs w:val="28"/>
+          <w:sz w:val="24"/>
+          <w:szCs w:val="24"/>
           <w:b/>
         </w:rPr>
         <w:t>Date: {contract_date}</w:t>

</xml_diff>